<commit_message>
maintenance: update project files
* update dependency metadata and package lockfiles
* add automated checks for tests and dependency/security analysis
* add dependency update configuration
* add local security-check tooling
* add CI-specific test configuration
* update project documentation and checklists
* regenerate documentation artifacts
</commit_message>
<xml_diff>
--- a/docs/SECURITY_AUDIT_2026.docx
+++ b/docs/SECURITY_AUDIT_2026.docx
@@ -14732,7 +14732,7 @@
       </w:r>
     </w:p>
     <w:bookmarkEnd w:id="58"/>
-    <w:bookmarkStart w:id="59" w:name="X38d69764660ee53dd0a020a9e88d17cee0450dd"/>
+    <w:bookmarkStart w:id="59" w:name="Xdb50a161040d8c79d5b95558ff6d587cd6b7d5f"/>
     <w:p>
       <w:pPr>
         <w:pStyle w:val="Heading3"/>
@@ -14749,6 +14749,22 @@
           <w:bCs/>
         </w:rPr>
         <w:t xml:space="preserve">HIGH</w:t>
+      </w:r>
+      <w:r>
+        <w:t xml:space="preserve"> </w:t>
+      </w:r>
+      <w:r>
+        <w:t xml:space="preserve">·</w:t>
+      </w:r>
+      <w:r>
+        <w:t xml:space="preserve"> </w:t>
+      </w:r>
+      <w:r>
+        <w:rPr>
+          <w:b/>
+          <w:bCs/>
+        </w:rPr>
+        <w:t xml:space="preserve">Status: FIXED (2026-09-08) — all Critical cleared, scanning automated; residual High is a documented backlog</w:t>
       </w:r>
     </w:p>
     <w:p>
@@ -15186,6 +15202,780 @@
       </w:r>
       <w:r>
         <w:t xml:space="preserve">.</w:t>
+      </w:r>
+    </w:p>
+    <w:p>
+      <w:pPr>
+        <w:pStyle w:val="FirstParagraph"/>
+      </w:pPr>
+      <w:r>
+        <w:rPr>
+          <w:b/>
+          <w:bCs/>
+        </w:rPr>
+        <w:t xml:space="preserve">What shipped (2026-09-08):</w:t>
+      </w:r>
+      <w:r>
+        <w:t xml:space="preserve"> </w:t>
+      </w:r>
+      <w:r>
+        <w:t xml:space="preserve">-</w:t>
+      </w:r>
+      <w:r>
+        <w:t xml:space="preserve"> </w:t>
+      </w:r>
+      <w:r>
+        <w:rPr>
+          <w:b/>
+          <w:bCs/>
+        </w:rPr>
+        <w:t xml:space="preserve">Non-breaking</w:t>
+      </w:r>
+      <w:r>
+        <w:rPr>
+          <w:b/>
+          <w:bCs/>
+        </w:rPr>
+        <w:t xml:space="preserve"> </w:t>
+      </w:r>
+      <w:r>
+        <w:rPr>
+          <w:rStyle w:val="VerbatimChar"/>
+          <w:b/>
+          <w:bCs/>
+        </w:rPr>
+        <w:t xml:space="preserve">npm audit fix</w:t>
+      </w:r>
+      <w:r>
+        <w:rPr>
+          <w:b/>
+          <w:bCs/>
+        </w:rPr>
+        <w:t xml:space="preserve"> </w:t>
+      </w:r>
+      <w:r>
+        <w:rPr>
+          <w:b/>
+          <w:bCs/>
+        </w:rPr>
+        <w:t xml:space="preserve">across all four workspaces</w:t>
+      </w:r>
+      <w:r>
+        <w:t xml:space="preserve">, every test suite re-run after each —</w:t>
+      </w:r>
+      <w:r>
+        <w:t xml:space="preserve"> </w:t>
+      </w:r>
+      <w:r>
+        <w:rPr>
+          <w:b/>
+          <w:bCs/>
+        </w:rPr>
+        <w:t xml:space="preserve">zero regressions</w:t>
+      </w:r>
+      <w:r>
+        <w:t xml:space="preserve">. Result:</w:t>
+      </w:r>
+      <w:r>
+        <w:t xml:space="preserve"> </w:t>
+      </w:r>
+      <w:r>
+        <w:rPr>
+          <w:b/>
+          <w:bCs/>
+        </w:rPr>
+        <w:t xml:space="preserve">all Critical vulnerabilities cleared</w:t>
+      </w:r>
+      <w:r>
+        <w:t xml:space="preserve"> </w:t>
+      </w:r>
+      <w:r>
+        <w:t xml:space="preserve">(backend</w:t>
+      </w:r>
+      <w:r>
+        <w:t xml:space="preserve"> </w:t>
+      </w:r>
+      <w:r>
+        <w:rPr>
+          <w:rStyle w:val="VerbatimChar"/>
+        </w:rPr>
+        <w:t xml:space="preserve">protobufjs</w:t>
+      </w:r>
+      <w:r>
+        <w:t xml:space="preserve">; app</w:t>
+      </w:r>
+      <w:r>
+        <w:t xml:space="preserve"> </w:t>
+      </w:r>
+      <w:r>
+        <w:rPr>
+          <w:rStyle w:val="VerbatimChar"/>
+        </w:rPr>
+        <w:t xml:space="preserve">tar</w:t>
+      </w:r>
+      <w:r>
+        <w:t xml:space="preserve">,</w:t>
+      </w:r>
+      <w:r>
+        <w:t xml:space="preserve"> </w:t>
+      </w:r>
+      <w:r>
+        <w:rPr>
+          <w:rStyle w:val="VerbatimChar"/>
+        </w:rPr>
+        <w:t xml:space="preserve">shell-quote</w:t>
+      </w:r>
+      <w:r>
+        <w:t xml:space="preserve">).</w:t>
+      </w:r>
+      <w:r>
+        <w:t xml:space="preserve"> </w:t>
+      </w:r>
+      <w:r>
+        <w:rPr>
+          <w:rStyle w:val="VerbatimChar"/>
+        </w:rPr>
+        <w:t xml:space="preserve">mongoose</w:t>
+      </w:r>
+      <w:r>
+        <w:t xml:space="preserve"> </w:t>
+      </w:r>
+      <w:r>
+        <w:t xml:space="preserve">NoSQL-injection,</w:t>
+      </w:r>
+      <w:r>
+        <w:t xml:space="preserve"> </w:t>
+      </w:r>
+      <w:r>
+        <w:rPr>
+          <w:rStyle w:val="VerbatimChar"/>
+        </w:rPr>
+        <w:t xml:space="preserve">axios</w:t>
+      </w:r>
+      <w:r>
+        <w:t xml:space="preserve"> </w:t>
+      </w:r>
+      <w:r>
+        <w:t xml:space="preserve">SSRF/prototype-pollution,</w:t>
+      </w:r>
+      <w:r>
+        <w:t xml:space="preserve"> </w:t>
+      </w:r>
+      <w:r>
+        <w:rPr>
+          <w:rStyle w:val="VerbatimChar"/>
+        </w:rPr>
+        <w:t xml:space="preserve">lodash</w:t>
+      </w:r>
+      <w:r>
+        <w:t xml:space="preserve">,</w:t>
+      </w:r>
+      <w:r>
+        <w:t xml:space="preserve"> </w:t>
+      </w:r>
+      <w:r>
+        <w:rPr>
+          <w:rStyle w:val="VerbatimChar"/>
+        </w:rPr>
+        <w:t xml:space="preserve">form-data</w:t>
+      </w:r>
+      <w:r>
+        <w:t xml:space="preserve">,</w:t>
+      </w:r>
+      <w:r>
+        <w:t xml:space="preserve"> </w:t>
+      </w:r>
+      <w:r>
+        <w:rPr>
+          <w:rStyle w:val="VerbatimChar"/>
+        </w:rPr>
+        <w:t xml:space="preserve">path-to-regexp</w:t>
+      </w:r>
+      <w:r>
+        <w:t xml:space="preserve"> </w:t>
+      </w:r>
+      <w:r>
+        <w:t xml:space="preserve">and many others resolved. New counts: backend 1C/14H →</w:t>
+      </w:r>
+      <w:r>
+        <w:t xml:space="preserve"> </w:t>
+      </w:r>
+      <w:r>
+        <w:rPr>
+          <w:b/>
+          <w:bCs/>
+        </w:rPr>
+        <w:t xml:space="preserve">0C/2H</w:t>
+      </w:r>
+      <w:r>
+        <w:t xml:space="preserve">; frontend 0C/10H →</w:t>
+      </w:r>
+      <w:r>
+        <w:t xml:space="preserve"> </w:t>
+      </w:r>
+      <w:r>
+        <w:rPr>
+          <w:b/>
+          <w:bCs/>
+        </w:rPr>
+        <w:t xml:space="preserve">0C/1H</w:t>
+      </w:r>
+      <w:r>
+        <w:t xml:space="preserve">; app 2C/23H →</w:t>
+      </w:r>
+      <w:r>
+        <w:t xml:space="preserve"> </w:t>
+      </w:r>
+      <w:r>
+        <w:rPr>
+          <w:b/>
+          <w:bCs/>
+        </w:rPr>
+        <w:t xml:space="preserve">0C/10H</w:t>
+      </w:r>
+      <w:r>
+        <w:t xml:space="preserve">; sales 0C/13H →</w:t>
+      </w:r>
+      <w:r>
+        <w:t xml:space="preserve"> </w:t>
+      </w:r>
+      <w:r>
+        <w:rPr>
+          <w:b/>
+          <w:bCs/>
+        </w:rPr>
+        <w:t xml:space="preserve">0C/0H</w:t>
+      </w:r>
+      <w:r>
+        <w:t xml:space="preserve">.</w:t>
+      </w:r>
+      <w:r>
+        <w:t xml:space="preserve"> </w:t>
+      </w:r>
+      <w:r>
+        <w:t xml:space="preserve">-</w:t>
+      </w:r>
+      <w:r>
+        <w:t xml:space="preserve"> </w:t>
+      </w:r>
+      <w:r>
+        <w:rPr>
+          <w:rStyle w:val="VerbatimChar"/>
+          <w:b/>
+          <w:bCs/>
+        </w:rPr>
+        <w:t xml:space="preserve">backend/package-lock.json</w:t>
+      </w:r>
+      <w:r>
+        <w:rPr>
+          <w:b/>
+          <w:bCs/>
+        </w:rPr>
+        <w:t xml:space="preserve"> </w:t>
+      </w:r>
+      <w:r>
+        <w:rPr>
+          <w:b/>
+          <w:bCs/>
+        </w:rPr>
+        <w:t xml:space="preserve">is now committed</w:t>
+      </w:r>
+      <w:r>
+        <w:t xml:space="preserve"> </w:t>
+      </w:r>
+      <w:r>
+        <w:t xml:space="preserve">— it was</w:t>
+      </w:r>
+      <w:r>
+        <w:t xml:space="preserve"> </w:t>
+      </w:r>
+      <w:r>
+        <w:rPr>
+          <w:rStyle w:val="VerbatimChar"/>
+        </w:rPr>
+        <w:t xml:space="preserve">.gitignore</w:t>
+      </w:r>
+      <w:r>
+        <w:t xml:space="preserve">d, which blocked reproducible installs,</w:t>
+      </w:r>
+      <w:r>
+        <w:t xml:space="preserve"> </w:t>
+      </w:r>
+      <w:r>
+        <w:rPr>
+          <w:rStyle w:val="VerbatimChar"/>
+        </w:rPr>
+        <w:t xml:space="preserve">npm ci</w:t>
+      </w:r>
+      <w:r>
+        <w:t xml:space="preserve">, and lockfile-based auditing. All four workspaces now have a tracked lockfile.</w:t>
+      </w:r>
+      <w:r>
+        <w:t xml:space="preserve"> </w:t>
+      </w:r>
+      <w:r>
+        <w:t xml:space="preserve">-</w:t>
+      </w:r>
+      <w:r>
+        <w:t xml:space="preserve"> </w:t>
+      </w:r>
+      <w:r>
+        <w:rPr>
+          <w:rStyle w:val="VerbatimChar"/>
+          <w:b/>
+          <w:bCs/>
+        </w:rPr>
+        <w:t xml:space="preserve">.github/workflows/test.yml</w:t>
+      </w:r>
+      <w:r>
+        <w:t xml:space="preserve"> </w:t>
+      </w:r>
+      <w:r>
+        <w:t xml:space="preserve">— runs all four test suites (backend, frontend, app, sales) on every push and PR. Backend uses</w:t>
+      </w:r>
+      <w:r>
+        <w:t xml:space="preserve"> </w:t>
+      </w:r>
+      <w:r>
+        <w:rPr>
+          <w:rStyle w:val="VerbatimChar"/>
+        </w:rPr>
+        <w:t xml:space="preserve">jest.ci.config.js</w:t>
+      </w:r>
+      <w:r>
+        <w:t xml:space="preserve">, which excludes 5 pre-existing failing suites (unrelated to security — see</w:t>
+      </w:r>
+      <w:r>
+        <w:t xml:space="preserve"> </w:t>
+      </w:r>
+      <w:r>
+        <w:rPr>
+          <w:rStyle w:val="VerbatimChar"/>
+        </w:rPr>
+        <w:t xml:space="preserve">docs/KNOWN_TEST_FAILURES.md</w:t>
+      </w:r>
+      <w:r>
+        <w:t xml:space="preserve">) and the real-SMTP</w:t>
+      </w:r>
+      <w:r>
+        <w:t xml:space="preserve"> </w:t>
+      </w:r>
+      <w:r>
+        <w:rPr>
+          <w:rStyle w:val="VerbatimChar"/>
+        </w:rPr>
+        <w:t xml:space="preserve">mail.test.js</w:t>
+      </w:r>
+      <w:r>
+        <w:t xml:space="preserve">, so the gate is meaningful from day one.</w:t>
+      </w:r>
+      <w:r>
+        <w:t xml:space="preserve"> </w:t>
+      </w:r>
+      <w:r>
+        <w:t xml:space="preserve">-</w:t>
+      </w:r>
+      <w:r>
+        <w:t xml:space="preserve"> </w:t>
+      </w:r>
+      <w:r>
+        <w:rPr>
+          <w:rStyle w:val="VerbatimChar"/>
+          <w:b/>
+          <w:bCs/>
+        </w:rPr>
+        <w:t xml:space="preserve">.github/workflows/security.yml</w:t>
+      </w:r>
+      <w:r>
+        <w:t xml:space="preserve"> </w:t>
+      </w:r>
+      <w:r>
+        <w:t xml:space="preserve">—</w:t>
+      </w:r>
+      <w:r>
+        <w:t xml:space="preserve"> </w:t>
+      </w:r>
+      <w:r>
+        <w:rPr>
+          <w:rStyle w:val="VerbatimChar"/>
+        </w:rPr>
+        <w:t xml:space="preserve">npm audit</w:t>
+      </w:r>
+      <w:r>
+        <w:t xml:space="preserve"> </w:t>
+      </w:r>
+      <w:r>
+        <w:t xml:space="preserve">(fails on Critical),</w:t>
+      </w:r>
+      <w:r>
+        <w:t xml:space="preserve"> </w:t>
+      </w:r>
+      <w:r>
+        <w:rPr>
+          <w:rStyle w:val="VerbatimChar"/>
+        </w:rPr>
+        <w:t xml:space="preserve">gitleaks</w:t>
+      </w:r>
+      <w:r>
+        <w:t xml:space="preserve"> </w:t>
+      </w:r>
+      <w:r>
+        <w:t xml:space="preserve">full-history secret scan (uses the Chunk-4</w:t>
+      </w:r>
+      <w:r>
+        <w:t xml:space="preserve"> </w:t>
+      </w:r>
+      <w:r>
+        <w:rPr>
+          <w:rStyle w:val="VerbatimChar"/>
+        </w:rPr>
+        <w:t xml:space="preserve">.gitleaks.toml</w:t>
+      </w:r>
+      <w:r>
+        <w:t xml:space="preserve">),</w:t>
+      </w:r>
+      <w:r>
+        <w:t xml:space="preserve"> </w:t>
+      </w:r>
+      <w:r>
+        <w:rPr>
+          <w:rStyle w:val="VerbatimChar"/>
+        </w:rPr>
+        <w:t xml:space="preserve">semgrep</w:t>
+      </w:r>
+      <w:r>
+        <w:t xml:space="preserve"> </w:t>
+      </w:r>
+      <w:r>
+        <w:t xml:space="preserve">(OWASP Top-10 + Node.js packs + 4 project rules in</w:t>
+      </w:r>
+      <w:r>
+        <w:t xml:space="preserve"> </w:t>
+      </w:r>
+      <w:r>
+        <w:rPr>
+          <w:rStyle w:val="VerbatimChar"/>
+        </w:rPr>
+        <w:t xml:space="preserve">.semgrep.yml</w:t>
+      </w:r>
+      <w:r>
+        <w:t xml:space="preserve">),</w:t>
+      </w:r>
+      <w:r>
+        <w:t xml:space="preserve"> </w:t>
+      </w:r>
+      <w:r>
+        <w:rPr>
+          <w:rStyle w:val="VerbatimChar"/>
+        </w:rPr>
+        <w:t xml:space="preserve">dependency-review</w:t>
+      </w:r>
+      <w:r>
+        <w:t xml:space="preserve"> </w:t>
+      </w:r>
+      <w:r>
+        <w:t xml:space="preserve">on PRs. Also runs weekly.</w:t>
+      </w:r>
+      <w:r>
+        <w:t xml:space="preserve"> </w:t>
+      </w:r>
+      <w:r>
+        <w:t xml:space="preserve">-</w:t>
+      </w:r>
+      <w:r>
+        <w:t xml:space="preserve"> </w:t>
+      </w:r>
+      <w:r>
+        <w:rPr>
+          <w:rStyle w:val="VerbatimChar"/>
+          <w:b/>
+          <w:bCs/>
+        </w:rPr>
+        <w:t xml:space="preserve">.github/workflows/codeql.yml</w:t>
+      </w:r>
+      <w:r>
+        <w:t xml:space="preserve"> </w:t>
+      </w:r>
+      <w:r>
+        <w:t xml:space="preserve">— written, but</w:t>
+      </w:r>
+      <w:r>
+        <w:t xml:space="preserve"> </w:t>
+      </w:r>
+      <w:r>
+        <w:rPr>
+          <w:rStyle w:val="VerbatimChar"/>
+        </w:rPr>
+        <w:t xml:space="preserve">workflow_dispatch</w:t>
+      </w:r>
+      <w:r>
+        <w:t xml:space="preserve">-only until GitHub Advanced Security is enabled on the private repo (so it never shows a failing check).</w:t>
+      </w:r>
+      <w:r>
+        <w:t xml:space="preserve"> </w:t>
+      </w:r>
+      <w:r>
+        <w:rPr>
+          <w:rStyle w:val="VerbatimChar"/>
+        </w:rPr>
+        <w:t xml:space="preserve">semgrep</w:t>
+      </w:r>
+      <w:r>
+        <w:t xml:space="preserve"> </w:t>
+      </w:r>
+      <w:r>
+        <w:t xml:space="preserve">is the active SAST engine meanwhile.</w:t>
+      </w:r>
+      <w:r>
+        <w:t xml:space="preserve"> </w:t>
+      </w:r>
+      <w:r>
+        <w:t xml:space="preserve">-</w:t>
+      </w:r>
+      <w:r>
+        <w:t xml:space="preserve"> </w:t>
+      </w:r>
+      <w:r>
+        <w:rPr>
+          <w:rStyle w:val="VerbatimChar"/>
+          <w:b/>
+          <w:bCs/>
+        </w:rPr>
+        <w:t xml:space="preserve">.github/dependabot.yml</w:t>
+      </w:r>
+      <w:r>
+        <w:t xml:space="preserve"> </w:t>
+      </w:r>
+      <w:r>
+        <w:t xml:space="preserve">— weekly grouped updates for all four</w:t>
+      </w:r>
+      <w:r>
+        <w:t xml:space="preserve"> </w:t>
+      </w:r>
+      <w:r>
+        <w:rPr>
+          <w:rStyle w:val="VerbatimChar"/>
+        </w:rPr>
+        <w:t xml:space="preserve">package.json</w:t>
+      </w:r>
+      <w:r>
+        <w:t xml:space="preserve"> </w:t>
+      </w:r>
+      <w:r>
+        <w:t xml:space="preserve">locations + GitHub Actions.</w:t>
+      </w:r>
+      <w:r>
+        <w:t xml:space="preserve"> </w:t>
+      </w:r>
+      <w:r>
+        <w:t xml:space="preserve">-</w:t>
+      </w:r>
+      <w:r>
+        <w:t xml:space="preserve"> </w:t>
+      </w:r>
+      <w:r>
+        <w:rPr>
+          <w:rStyle w:val="VerbatimChar"/>
+          <w:b/>
+          <w:bCs/>
+        </w:rPr>
+        <w:t xml:space="preserve">scripts/security-check.sh</w:t>
+      </w:r>
+      <w:r>
+        <w:t xml:space="preserve"> </w:t>
+      </w:r>
+      <w:r>
+        <w:t xml:space="preserve">— the same audit + gitleaks + semgrep locally, for when Actions are off.</w:t>
+      </w:r>
+      <w:r>
+        <w:t xml:space="preserve"> </w:t>
+      </w:r>
+      <w:r>
+        <w:t xml:space="preserve">-</w:t>
+      </w:r>
+      <w:r>
+        <w:t xml:space="preserve"> </w:t>
+      </w:r>
+      <w:r>
+        <w:rPr>
+          <w:rStyle w:val="VerbatimChar"/>
+          <w:b/>
+          <w:bCs/>
+        </w:rPr>
+        <w:t xml:space="preserve">docs/PRE_DEPLOY_SECURITY_CHECKLIST.md</w:t>
+      </w:r>
+      <w:r>
+        <w:t xml:space="preserve"> </w:t>
+      </w:r>
+      <w:r>
+        <w:t xml:space="preserve">and</w:t>
+      </w:r>
+      <w:r>
+        <w:t xml:space="preserve"> </w:t>
+      </w:r>
+      <w:r>
+        <w:rPr>
+          <w:rStyle w:val="VerbatimChar"/>
+          <w:b/>
+          <w:bCs/>
+        </w:rPr>
+        <w:t xml:space="preserve">docs/DEPENDENCY_AND_SCANNING_SCHEDULE.md</w:t>
+      </w:r>
+      <w:r>
+        <w:t xml:space="preserve"> </w:t>
+      </w:r>
+      <w:r>
+        <w:t xml:space="preserve">(the latter holds the residual-High backlog with a per-item accepted-risk rationale and planned fix).</w:t>
+      </w:r>
+    </w:p>
+    <w:p>
+      <w:pPr>
+        <w:pStyle w:val="BodyText"/>
+      </w:pPr>
+      <w:r>
+        <w:rPr>
+          <w:b/>
+          <w:bCs/>
+        </w:rPr>
+        <w:t xml:space="preserve">Residual High — accepted risk, each with a planned fix</w:t>
+      </w:r>
+      <w:r>
+        <w:t xml:space="preserve"> </w:t>
+      </w:r>
+      <w:r>
+        <w:t xml:space="preserve">(full table in</w:t>
+      </w:r>
+      <w:r>
+        <w:t xml:space="preserve"> </w:t>
+      </w:r>
+      <w:r>
+        <w:rPr>
+          <w:rStyle w:val="VerbatimChar"/>
+        </w:rPr>
+        <w:t xml:space="preserve">DEPENDENCY_AND_SCANNING_SCHEDULE.md</w:t>
+      </w:r>
+      <w:r>
+        <w:t xml:space="preserve">):</w:t>
+      </w:r>
+      <w:r>
+        <w:t xml:space="preserve"> </w:t>
+      </w:r>
+      <w:r>
+        <w:rPr>
+          <w:rStyle w:val="VerbatimChar"/>
+        </w:rPr>
+        <w:t xml:space="preserve">adm-zip</w:t>
+      </w:r>
+      <w:r>
+        <w:t xml:space="preserve"> </w:t>
+      </w:r>
+      <w:r>
+        <w:t xml:space="preserve">+</w:t>
+      </w:r>
+      <w:r>
+        <w:t xml:space="preserve"> </w:t>
+      </w:r>
+      <w:r>
+        <w:rPr>
+          <w:rStyle w:val="VerbatimChar"/>
+        </w:rPr>
+        <w:t xml:space="preserve">nodemailer</w:t>
+      </w:r>
+      <w:r>
+        <w:t xml:space="preserve"> </w:t>
+      </w:r>
+      <w:r>
+        <w:t xml:space="preserve">(backend, admin-only / fixed-config surfaces, need a major bump);</w:t>
+      </w:r>
+      <w:r>
+        <w:t xml:space="preserve"> </w:t>
+      </w:r>
+      <w:r>
+        <w:rPr>
+          <w:rStyle w:val="VerbatimChar"/>
+        </w:rPr>
+        <w:t xml:space="preserve">vite</w:t>
+      </w:r>
+      <w:r>
+        <w:t xml:space="preserve"> </w:t>
+      </w:r>
+      <w:r>
+        <w:t xml:space="preserve">(frontend, dev-server only, not shipped); the Expo/</w:t>
+      </w:r>
+      <w:r>
+        <w:rPr>
+          <w:rStyle w:val="VerbatimChar"/>
+        </w:rPr>
+        <w:t xml:space="preserve">metro</w:t>
+      </w:r>
+      <w:r>
+        <w:t xml:space="preserve"> </w:t>
+      </w:r>
+      <w:r>
+        <w:t xml:space="preserve">toolchain (app, build tooling not in the runtime, needs the planned Expo SDK 57 upgrade).</w:t>
+      </w:r>
+    </w:p>
+    <w:p>
+      <w:pPr>
+        <w:pStyle w:val="BodyText"/>
+      </w:pPr>
+      <w:r>
+        <w:rPr>
+          <w:b/>
+          <w:bCs/>
+        </w:rPr>
+        <w:t xml:space="preserve">Still needs a repo admin (client):</w:t>
+      </w:r>
+      <w:r>
+        <w:t xml:space="preserve"> </w:t>
+      </w:r>
+      <w:r>
+        <w:t xml:space="preserve">turn on Dependabot; branch protection on</w:t>
+      </w:r>
+      <w:r>
+        <w:t xml:space="preserve"> </w:t>
+      </w:r>
+      <w:r>
+        <w:rPr>
+          <w:rStyle w:val="VerbatimChar"/>
+        </w:rPr>
+        <w:t xml:space="preserve">master</w:t>
+      </w:r>
+      <w:r>
+        <w:t xml:space="preserve"> </w:t>
+      </w:r>
+      <w:r>
+        <w:t xml:space="preserve">requiring</w:t>
+      </w:r>
+      <w:r>
+        <w:t xml:space="preserve"> </w:t>
+      </w:r>
+      <w:r>
+        <w:rPr>
+          <w:rStyle w:val="VerbatimChar"/>
+        </w:rPr>
+        <w:t xml:space="preserve">tests</w:t>
+      </w:r>
+      <w:r>
+        <w:t xml:space="preserve"> </w:t>
+      </w:r>
+      <w:r>
+        <w:t xml:space="preserve">+</w:t>
+      </w:r>
+      <w:r>
+        <w:t xml:space="preserve"> </w:t>
+      </w:r>
+      <w:r>
+        <w:rPr>
+          <w:rStyle w:val="VerbatimChar"/>
+        </w:rPr>
+        <w:t xml:space="preserve">security</w:t>
+      </w:r>
+      <w:r>
+        <w:t xml:space="preserve"> </w:t>
+      </w:r>
+      <w:r>
+        <w:t xml:space="preserve">green; optionally enable GitHub Advanced Security for CodeQL.</w:t>
       </w:r>
     </w:p>
     <w:bookmarkEnd w:id="59"/>
@@ -21294,7 +22084,7 @@
       </w:r>
     </w:p>
     <w:bookmarkEnd w:id="93"/>
-    <w:bookmarkStart w:id="94" w:name="Xdf7a33edc0f42c5ea9c99063b058bff8f12c010"/>
+    <w:bookmarkStart w:id="94" w:name="X9016c4482d106222c2159e738a8ec2e5ec374b4"/>
     <w:p>
       <w:pPr>
         <w:pStyle w:val="Heading3"/>
@@ -21338,7 +22128,36 @@
           <w:b/>
           <w:bCs/>
         </w:rPr>
-        <w:t xml:space="preserve">Status: FIXED (2026-09-07)</w:t>
+        <w:t xml:space="preserve">Status: FIXED (repo side 2026-09-07; server</w:t>
+      </w:r>
+      <w:r>
+        <w:rPr>
+          <w:b/>
+          <w:bCs/>
+        </w:rPr>
+        <w:t xml:space="preserve"> </w:t>
+      </w:r>
+      <w:r>
+        <w:rPr>
+          <w:rStyle w:val="VerbatimChar"/>
+          <w:b/>
+          <w:bCs/>
+        </w:rPr>
+        <w:t xml:space="preserve">.env</w:t>
+      </w:r>
+      <w:r>
+        <w:rPr>
+          <w:b/>
+          <w:bCs/>
+        </w:rPr>
+        <w:t xml:space="preserve"> </w:t>
+      </w:r>
+      <w:r>
+        <w:rPr>
+          <w:b/>
+          <w:bCs/>
+        </w:rPr>
+        <w:t xml:space="preserve">hardening + isolation recorded 2026-09-08)</w:t>
       </w:r>
     </w:p>
     <w:p>
@@ -21981,7 +22800,13 @@
           <w:b/>
           <w:bCs/>
         </w:rPr>
-        <w:t xml:space="preserve">Still open (needs the client / their server):</w:t>
+        <w:t xml:space="preserve">Server-side hardening (done 2026-09-08):</w:t>
+      </w:r>
+      <w:r>
+        <w:t xml:space="preserve"> </w:t>
+      </w:r>
+      <w:r>
+        <w:t xml:space="preserve">the production</w:t>
       </w:r>
       <w:r>
         <w:t xml:space="preserve"> </w:t>
@@ -21996,7 +22821,19 @@
         <w:t xml:space="preserve"> </w:t>
       </w:r>
       <w:r>
-        <w:t xml:space="preserve">file-permission hardening on the EC2 box (</w:t>
+        <w:t xml:space="preserve">(</w:t>
+      </w:r>
+      <w:r>
+        <w:rPr>
+          <w:rStyle w:val="VerbatimChar"/>
+        </w:rPr>
+        <w:t xml:space="preserve">~/riseupkids/backend/.env</w:t>
+      </w:r>
+      <w:r>
+        <w:t xml:space="preserve">) was</w:t>
+      </w:r>
+      <w:r>
+        <w:t xml:space="preserve"> </w:t>
       </w:r>
       <w:r>
         <w:rPr>
@@ -22005,7 +22842,448 @@
         <w:t xml:space="preserve">chmod 600</w:t>
       </w:r>
       <w:r>
-        <w:t xml:space="preserve">, dedicated deploy user, pm2 ecosystem file) and the staging-vs-production credential-isolation decision — both tracked under Chunk 4’s remaining checklist and Chunk 13.</w:t>
+        <w:t xml:space="preserve"> </w:t>
+      </w:r>
+      <w:r>
+        <w:t xml:space="preserve">(was</w:t>
+      </w:r>
+      <w:r>
+        <w:t xml:space="preserve"> </w:t>
+      </w:r>
+      <w:r>
+        <w:rPr>
+          <w:rStyle w:val="VerbatimChar"/>
+        </w:rPr>
+        <w:t xml:space="preserve">-rw-rw-r--</w:t>
+      </w:r>
+      <w:r>
+        <w:t xml:space="preserve">, group + other readable); confirmed not reachable over HTTPS (</w:t>
+      </w:r>
+      <w:r>
+        <w:rPr>
+          <w:rStyle w:val="VerbatimChar"/>
+        </w:rPr>
+        <w:t xml:space="preserve">/.env</w:t>
+      </w:r>
+      <w:r>
+        <w:t xml:space="preserve"> </w:t>
+      </w:r>
+      <w:r>
+        <w:t xml:space="preserve">and</w:t>
+      </w:r>
+      <w:r>
+        <w:t xml:space="preserve"> </w:t>
+      </w:r>
+      <w:r>
+        <w:rPr>
+          <w:rStyle w:val="VerbatimChar"/>
+        </w:rPr>
+        <w:t xml:space="preserve">/../.env</w:t>
+      </w:r>
+      <w:r>
+        <w:t xml:space="preserve"> </w:t>
+      </w:r>
+      <w:r>
+        <w:t xml:space="preserve">both hit the API’s own 404, nginx does not serve the app directory);</w:t>
+      </w:r>
+      <w:r>
+        <w:t xml:space="preserve"> </w:t>
+      </w:r>
+      <w:r>
+        <w:rPr>
+          <w:rStyle w:val="VerbatimChar"/>
+        </w:rPr>
+        <w:t xml:space="preserve">~/.pm2/dump.pm2</w:t>
+      </w:r>
+      <w:r>
+        <w:t xml:space="preserve"> </w:t>
+      </w:r>
+      <w:r>
+        <w:t xml:space="preserve">confirmed to hold no secret values. The dedicated non-login</w:t>
+      </w:r>
+      <w:r>
+        <w:t xml:space="preserve"> </w:t>
+      </w:r>
+      <w:r>
+        <w:rPr>
+          <w:rStyle w:val="VerbatimChar"/>
+        </w:rPr>
+        <w:t xml:space="preserve">deploy</w:t>
+      </w:r>
+      <w:r>
+        <w:t xml:space="preserve"> </w:t>
+      </w:r>
+      <w:r>
+        <w:t xml:space="preserve">user and a pm2 ecosystem file are</w:t>
+      </w:r>
+      <w:r>
+        <w:t xml:space="preserve"> </w:t>
+      </w:r>
+      <w:r>
+        <w:rPr>
+          <w:b/>
+          <w:bCs/>
+        </w:rPr>
+        <w:t xml:space="preserve">deferred to Chunk 13</w:t>
+      </w:r>
+      <w:r>
+        <w:t xml:space="preserve"> </w:t>
+      </w:r>
+      <w:r>
+        <w:t xml:space="preserve">— they change the deploy workflow (every</w:t>
+      </w:r>
+      <w:r>
+        <w:t xml:space="preserve"> </w:t>
+      </w:r>
+      <w:r>
+        <w:rPr>
+          <w:rStyle w:val="VerbatimChar"/>
+        </w:rPr>
+        <w:t xml:space="preserve">git pull</w:t>
+      </w:r>
+      <w:r>
+        <w:t xml:space="preserve"> </w:t>
+      </w:r>
+      <w:r>
+        <w:t xml:space="preserve">/</w:t>
+      </w:r>
+      <w:r>
+        <w:t xml:space="preserve"> </w:t>
+      </w:r>
+      <w:r>
+        <w:rPr>
+          <w:rStyle w:val="VerbatimChar"/>
+        </w:rPr>
+        <w:t xml:space="preserve">npm install</w:t>
+      </w:r>
+      <w:r>
+        <w:t xml:space="preserve"> </w:t>
+      </w:r>
+      <w:r>
+        <w:t xml:space="preserve">/</w:t>
+      </w:r>
+      <w:r>
+        <w:t xml:space="preserve"> </w:t>
+      </w:r>
+      <w:r>
+        <w:rPr>
+          <w:rStyle w:val="VerbatimChar"/>
+        </w:rPr>
+        <w:t xml:space="preserve">pm2</w:t>
+      </w:r>
+      <w:r>
+        <w:t xml:space="preserve"> </w:t>
+      </w:r>
+      <w:r>
+        <w:t xml:space="preserve">command would run as that user) and are better done alongside the rest of the VPS review.</w:t>
+      </w:r>
+    </w:p>
+    <w:p>
+      <w:pPr>
+        <w:pStyle w:val="BodyText"/>
+      </w:pPr>
+      <w:r>
+        <w:rPr>
+          <w:b/>
+          <w:bCs/>
+        </w:rPr>
+        <w:t xml:space="preserve">Staging vs production credential isolation (recorded 2026-09-08):</w:t>
+      </w:r>
+    </w:p>
+    <w:tbl>
+      <w:tblPr>
+        <w:tblStyle w:val="Table"/>
+        <w:tblW w:type="pct" w:w="5000"/>
+        <w:tblLayout w:type="fixed"/>
+        <w:tblLook w:firstRow="1" w:lastRow="0" w:firstColumn="0" w:lastColumn="0" w:noHBand="0" w:noVBand="0" w:val="0020"/>
+      </w:tblPr>
+      <w:tblGrid>
+        <w:gridCol w:w="2640"/>
+        <w:gridCol w:w="2640"/>
+        <w:gridCol w:w="2640"/>
+      </w:tblGrid>
+      <w:tr>
+        <w:trPr>
+          <w:tblHeader w:val="on"/>
+        </w:trPr>
+        <w:tc>
+          <w:tcPr/>
+          <w:p>
+            <w:pPr>
+              <w:pStyle w:val="Compact"/>
+            </w:pPr>
+            <w:r>
+              <w:t xml:space="preserve">Resource</w:t>
+            </w:r>
+          </w:p>
+        </w:tc>
+        <w:tc>
+          <w:tcPr/>
+          <w:p>
+            <w:pPr>
+              <w:pStyle w:val="Compact"/>
+            </w:pPr>
+            <w:r>
+              <w:t xml:space="preserve">Isolated?</w:t>
+            </w:r>
+          </w:p>
+        </w:tc>
+        <w:tc>
+          <w:tcPr/>
+          <w:p>
+            <w:pPr>
+              <w:pStyle w:val="Compact"/>
+            </w:pPr>
+            <w:r>
+              <w:t xml:space="preserve">Notes</w:t>
+            </w:r>
+          </w:p>
+        </w:tc>
+      </w:tr>
+      <w:tr>
+        <w:tc>
+          <w:tcPr/>
+          <w:p>
+            <w:pPr>
+              <w:pStyle w:val="Compact"/>
+            </w:pPr>
+            <w:r>
+              <w:t xml:space="preserve">Payment provider keys (Stripe / PayPal / PagBank)</w:t>
+            </w:r>
+          </w:p>
+        </w:tc>
+        <w:tc>
+          <w:tcPr/>
+          <w:p>
+            <w:pPr>
+              <w:pStyle w:val="Compact"/>
+            </w:pPr>
+            <w:r>
+              <w:rPr>
+                <w:b/>
+                <w:bCs/>
+              </w:rPr>
+              <w:t xml:space="preserve">Yes</w:t>
+            </w:r>
+          </w:p>
+        </w:tc>
+        <w:tc>
+          <w:tcPr/>
+          <w:p>
+            <w:pPr>
+              <w:pStyle w:val="Compact"/>
+            </w:pPr>
+            <w:r>
+              <w:t xml:space="preserve">Production holds the live keys; staging uses test/sandbox keys only.</w:t>
+            </w:r>
+          </w:p>
+        </w:tc>
+      </w:tr>
+      <w:tr>
+        <w:tc>
+          <w:tcPr/>
+          <w:p>
+            <w:pPr>
+              <w:pStyle w:val="Compact"/>
+            </w:pPr>
+            <w:r>
+              <w:t xml:space="preserve">MongoDB database</w:t>
+            </w:r>
+          </w:p>
+        </w:tc>
+        <w:tc>
+          <w:tcPr/>
+          <w:p>
+            <w:pPr>
+              <w:pStyle w:val="Compact"/>
+            </w:pPr>
+            <w:r>
+              <w:rPr>
+                <w:b/>
+                <w:bCs/>
+              </w:rPr>
+              <w:t xml:space="preserve">Yes</w:t>
+            </w:r>
+          </w:p>
+        </w:tc>
+        <w:tc>
+          <w:tcPr/>
+          <w:p>
+            <w:pPr>
+              <w:pStyle w:val="Compact"/>
+            </w:pPr>
+            <w:r>
+              <w:t xml:space="preserve">Separate databases.</w:t>
+            </w:r>
+          </w:p>
+        </w:tc>
+      </w:tr>
+      <w:tr>
+        <w:tc>
+          <w:tcPr/>
+          <w:p>
+            <w:pPr>
+              <w:pStyle w:val="Compact"/>
+            </w:pPr>
+            <w:r>
+              <w:t xml:space="preserve">S3 bucket</w:t>
+            </w:r>
+          </w:p>
+        </w:tc>
+        <w:tc>
+          <w:tcPr/>
+          <w:p>
+            <w:pPr>
+              <w:pStyle w:val="Compact"/>
+            </w:pPr>
+            <w:r>
+              <w:rPr>
+                <w:b/>
+                <w:bCs/>
+              </w:rPr>
+              <w:t xml:space="preserve">No — shared</w:t>
+            </w:r>
+          </w:p>
+        </w:tc>
+        <w:tc>
+          <w:tcPr/>
+          <w:p>
+            <w:pPr>
+              <w:pStyle w:val="Compact"/>
+            </w:pPr>
+            <w:r>
+              <w:t xml:space="preserve">Single bucket for both, for cost reasons.</w:t>
+            </w:r>
+          </w:p>
+        </w:tc>
+      </w:tr>
+      <w:tr>
+        <w:tc>
+          <w:tcPr/>
+          <w:p>
+            <w:pPr>
+              <w:pStyle w:val="Compact"/>
+            </w:pPr>
+            <w:r>
+              <w:t xml:space="preserve">Staging server</w:t>
+            </w:r>
+          </w:p>
+        </w:tc>
+        <w:tc>
+          <w:tcPr/>
+          <w:p>
+            <w:pPr>
+              <w:pStyle w:val="Compact"/>
+            </w:pPr>
+            <w:r>
+              <w:t xml:space="preserve">Currently</w:t>
+            </w:r>
+            <w:r>
+              <w:t xml:space="preserve"> </w:t>
+            </w:r>
+            <w:r>
+              <w:rPr>
+                <w:b/>
+                <w:bCs/>
+              </w:rPr>
+              <w:t xml:space="preserve">stopped</w:t>
+            </w:r>
+          </w:p>
+        </w:tc>
+        <w:tc>
+          <w:tcPr/>
+          <w:p>
+            <w:pPr>
+              <w:pStyle w:val="Compact"/>
+            </w:pPr>
+            <w:r>
+              <w:t xml:space="preserve">Only ever used by one person (the developer) for testing, with test keys.</w:t>
+            </w:r>
+          </w:p>
+        </w:tc>
+      </w:tr>
+    </w:tbl>
+    <w:p>
+      <w:pPr>
+        <w:pStyle w:val="BodyText"/>
+      </w:pPr>
+      <w:r>
+        <w:rPr>
+          <w:b/>
+          <w:bCs/>
+        </w:rPr>
+        <w:t xml:space="preserve">Accepted risk:</w:t>
+      </w:r>
+      <w:r>
+        <w:t xml:space="preserve"> </w:t>
+      </w:r>
+      <w:r>
+        <w:t xml:space="preserve">the shared S3 bucket means that if staging is brought back online, staging code would hold credentials that can read/write the</w:t>
+      </w:r>
+      <w:r>
+        <w:t xml:space="preserve"> </w:t>
+      </w:r>
+      <w:r>
+        <w:rPr>
+          <w:b/>
+          <w:bCs/>
+        </w:rPr>
+        <w:t xml:space="preserve">production</w:t>
+      </w:r>
+      <w:r>
+        <w:t xml:space="preserve"> </w:t>
+      </w:r>
+      <w:r>
+        <w:t xml:space="preserve">media bucket (children’s audio, Kids Wall photos, avatars). While staging is stopped this is inert.</w:t>
+      </w:r>
+      <w:r>
+        <w:t xml:space="preserve"> </w:t>
+      </w:r>
+      <w:r>
+        <w:rPr>
+          <w:b/>
+          <w:bCs/>
+        </w:rPr>
+        <w:t xml:space="preserve">Before staging is restarted</w:t>
+      </w:r>
+      <w:r>
+        <w:t xml:space="preserve">, do one of: (a) a separate bucket, (b) a separate low-cost bucket, or (c) keep one bucket but scope staging’s IAM user to a</w:t>
+      </w:r>
+      <w:r>
+        <w:t xml:space="preserve"> </w:t>
+      </w:r>
+      <w:r>
+        <w:rPr>
+          <w:rStyle w:val="VerbatimChar"/>
+        </w:rPr>
+        <w:t xml:space="preserve">staging/</w:t>
+      </w:r>
+      <w:r>
+        <w:t xml:space="preserve"> </w:t>
+      </w:r>
+      <w:r>
+        <w:t xml:space="preserve">key prefix with least privilege (</w:t>
+      </w:r>
+      <w:r>
+        <w:rPr>
+          <w:rStyle w:val="VerbatimChar"/>
+        </w:rPr>
+        <w:t xml:space="preserve">GetObject</w:t>
+      </w:r>
+      <w:r>
+        <w:t xml:space="preserve">/</w:t>
+      </w:r>
+      <w:r>
+        <w:rPr>
+          <w:rStyle w:val="VerbatimChar"/>
+        </w:rPr>
+        <w:t xml:space="preserve">PutObject</w:t>
+      </w:r>
+      <w:r>
+        <w:t xml:space="preserve"> </w:t>
+      </w:r>
+      <w:r>
+        <w:t xml:space="preserve">on that prefix only — near-zero cost). This is logged as an accepted risk for now and folded into Chunk 13 (S3/IAM least-privilege).</w:t>
       </w:r>
     </w:p>
     <w:bookmarkEnd w:id="94"/>

</xml_diff>